<commit_message>
added kurtosis and data imbalance coping mechanisms
</commit_message>
<xml_diff>
--- a/Project 2 EDA/EDA Project Report.docx
+++ b/Project 2 EDA/EDA Project Report.docx
@@ -5,24 +5,24 @@
     <w:p>
       <w:pPr>
         <w:spacing w:line="360" w:lineRule="auto"/>
-        <w:jc w:val="both"/>
-        <w:rPr>
-          <w:rFonts w:hint="default" w:ascii="Times New Roman" w:hAnsi="Times New Roman" w:cs="Times New Roman"/>
-          <w:b/>
-          <w:bCs/>
-          <w:sz w:val="22"/>
-          <w:szCs w:val="22"/>
-        </w:rPr>
-      </w:pPr>
-      <w:r>
-        <w:rPr>
-          <w:rFonts w:hint="default" w:ascii="Times New Roman" w:hAnsi="Times New Roman" w:cs="Times New Roman"/>
-          <w:b/>
-          <w:bCs/>
-          <w:sz w:val="22"/>
-          <w:szCs w:val="22"/>
-        </w:rPr>
-        <w:t>Data Science Project Report: Credit Risk Analysis</w:t>
+        <w:jc w:val="center"/>
+        <w:rPr>
+          <w:rFonts w:hint="default" w:ascii="Times New Roman" w:hAnsi="Times New Roman" w:cs="Times New Roman"/>
+          <w:b/>
+          <w:bCs/>
+          <w:sz w:val="22"/>
+          <w:szCs w:val="22"/>
+        </w:rPr>
+      </w:pPr>
+      <w:r>
+        <w:rPr>
+          <w:rFonts w:hint="default" w:ascii="Times New Roman" w:hAnsi="Times New Roman" w:cs="Times New Roman"/>
+          <w:b/>
+          <w:bCs/>
+          <w:sz w:val="22"/>
+          <w:szCs w:val="22"/>
+        </w:rPr>
+        <w:t>DATA SCIENCE PROJECT REPORT: CREDIT RISK ANALYSIS</w:t>
       </w:r>
     </w:p>
     <w:p>
@@ -176,70 +176,6 @@
           <w:lang w:val="en-US"/>
         </w:rPr>
         <w:t>Tsion Moges</w:t>
-      </w:r>
-    </w:p>
-    <w:p>
-      <w:pPr>
-        <w:spacing w:line="360" w:lineRule="auto"/>
-        <w:jc w:val="both"/>
-        <w:rPr>
-          <w:rFonts w:hint="default" w:ascii="Times New Roman" w:hAnsi="Times New Roman" w:cs="Times New Roman"/>
-          <w:sz w:val="22"/>
-          <w:szCs w:val="22"/>
-          <w:lang w:val="en-US"/>
-        </w:rPr>
-      </w:pPr>
-    </w:p>
-    <w:p>
-      <w:pPr>
-        <w:numPr>
-          <w:ilvl w:val="0"/>
-          <w:numId w:val="1"/>
-        </w:numPr>
-        <w:spacing w:line="360" w:lineRule="auto"/>
-        <w:jc w:val="both"/>
-        <w:rPr>
-          <w:rFonts w:hint="default" w:ascii="Times New Roman" w:hAnsi="Times New Roman" w:cs="Times New Roman"/>
-          <w:b/>
-          <w:bCs/>
-          <w:color w:val="851321" w:themeColor="accent6" w:themeShade="80"/>
-          <w:sz w:val="22"/>
-          <w:szCs w:val="22"/>
-          <w:lang w:val="en-US"/>
-        </w:rPr>
-      </w:pPr>
-      <w:r>
-        <w:rPr>
-          <w:rFonts w:hint="default" w:ascii="Times New Roman" w:hAnsi="Times New Roman" w:cs="Times New Roman"/>
-          <w:b/>
-          <w:bCs/>
-          <w:color w:val="851321" w:themeColor="accent6" w:themeShade="80"/>
-          <w:sz w:val="22"/>
-          <w:szCs w:val="22"/>
-          <w:lang w:val="en-US"/>
-        </w:rPr>
-        <w:t>EXECUTIVE SUMMARY</w:t>
-      </w:r>
-    </w:p>
-    <w:p>
-      <w:pPr>
-        <w:spacing w:line="360" w:lineRule="auto"/>
-        <w:jc w:val="both"/>
-        <w:rPr>
-          <w:rFonts w:hint="default" w:ascii="Times New Roman" w:hAnsi="Times New Roman" w:cs="Times New Roman"/>
-          <w:sz w:val="22"/>
-          <w:szCs w:val="22"/>
-          <w:lang w:val="en-US"/>
-        </w:rPr>
-      </w:pPr>
-      <w:r>
-        <w:rPr>
-          <w:rFonts w:hint="default" w:ascii="Times New Roman" w:hAnsi="Times New Roman" w:cs="Times New Roman"/>
-          <w:sz w:val="22"/>
-          <w:szCs w:val="22"/>
-          <w:lang w:val="en-US"/>
-        </w:rPr>
-        <w:t>The objective of this analysis was to explore a historical credit dataset of 150,000 borrowers. The primary goal was to understand the characteristics of borrowers who experience "Financial Distress" within a two-year period. Our analysis identified past payment due behavior and credit utilization as the most critical risk indicators.</w:t>
       </w:r>
     </w:p>
     <w:p>
@@ -255,6 +191,70 @@
       </w:pPr>
       <w:bookmarkStart w:id="0" w:name="_GoBack"/>
       <w:bookmarkEnd w:id="0"/>
+    </w:p>
+    <w:p>
+      <w:pPr>
+        <w:numPr>
+          <w:ilvl w:val="0"/>
+          <w:numId w:val="1"/>
+        </w:numPr>
+        <w:spacing w:line="360" w:lineRule="auto"/>
+        <w:jc w:val="both"/>
+        <w:rPr>
+          <w:rFonts w:hint="default" w:ascii="Times New Roman" w:hAnsi="Times New Roman" w:cs="Times New Roman"/>
+          <w:b/>
+          <w:bCs/>
+          <w:color w:val="851321" w:themeColor="accent6" w:themeShade="80"/>
+          <w:sz w:val="22"/>
+          <w:szCs w:val="22"/>
+          <w:lang w:val="en-US"/>
+        </w:rPr>
+      </w:pPr>
+      <w:r>
+        <w:rPr>
+          <w:rFonts w:hint="default" w:ascii="Times New Roman" w:hAnsi="Times New Roman" w:cs="Times New Roman"/>
+          <w:b/>
+          <w:bCs/>
+          <w:color w:val="851321" w:themeColor="accent6" w:themeShade="80"/>
+          <w:sz w:val="22"/>
+          <w:szCs w:val="22"/>
+          <w:lang w:val="en-US"/>
+        </w:rPr>
+        <w:t>EXECUTIVE SUMMARY</w:t>
+      </w:r>
+    </w:p>
+    <w:p>
+      <w:pPr>
+        <w:spacing w:line="360" w:lineRule="auto"/>
+        <w:jc w:val="both"/>
+        <w:rPr>
+          <w:rFonts w:hint="default" w:ascii="Times New Roman" w:hAnsi="Times New Roman" w:cs="Times New Roman"/>
+          <w:sz w:val="22"/>
+          <w:szCs w:val="22"/>
+          <w:lang w:val="en-US"/>
+        </w:rPr>
+      </w:pPr>
+      <w:r>
+        <w:rPr>
+          <w:rFonts w:hint="default" w:ascii="Times New Roman" w:hAnsi="Times New Roman" w:cs="Times New Roman"/>
+          <w:sz w:val="22"/>
+          <w:szCs w:val="22"/>
+          <w:lang w:val="en-US"/>
+        </w:rPr>
+        <w:t>The objective of this analysis was to explore a historical credit dataset of 150,000 borrowers. The primary goal was to understand the characteristics of borrowers who experience "Financial Distress" within a two-year period. Our analysis identified past payment due behavior and credit utilization as the most critical risk indicators.</w:t>
+      </w:r>
+    </w:p>
+    <w:p>
+      <w:pPr>
+        <w:spacing w:line="360" w:lineRule="auto"/>
+        <w:jc w:val="both"/>
+        <w:rPr>
+          <w:rFonts w:hint="default" w:ascii="Times New Roman" w:hAnsi="Times New Roman" w:cs="Times New Roman"/>
+          <w:sz w:val="22"/>
+          <w:szCs w:val="22"/>
+          <w:lang w:val="en-US"/>
+        </w:rPr>
+      </w:pPr>
     </w:p>
     <w:p>
       <w:pPr>
@@ -1735,6 +1735,7 @@
     <w:p>
       <w:pPr>
         <w:numPr>
+          <w:ilvl w:val="0"/>
           <w:numId w:val="0"/>
         </w:numPr>
         <w:spacing w:line="360" w:lineRule="auto"/>
@@ -1763,6 +1764,7 @@
     <w:p>
       <w:pPr>
         <w:numPr>
+          <w:ilvl w:val="0"/>
           <w:numId w:val="0"/>
         </w:numPr>
         <w:spacing w:line="360" w:lineRule="auto"/>
@@ -1810,6 +1812,7 @@
     <w:p>
       <w:pPr>
         <w:numPr>
+          <w:ilvl w:val="0"/>
           <w:numId w:val="0"/>
         </w:numPr>
         <w:spacing w:line="360" w:lineRule="auto"/>
@@ -1828,6 +1831,7 @@
     <w:p>
       <w:pPr>
         <w:numPr>
+          <w:ilvl w:val="0"/>
           <w:numId w:val="0"/>
         </w:numPr>
         <w:spacing w:line="360" w:lineRule="auto"/>
@@ -1857,6 +1861,7 @@
     <w:p>
       <w:pPr>
         <w:numPr>
+          <w:ilvl w:val="0"/>
           <w:numId w:val="0"/>
         </w:numPr>
         <w:spacing w:line="360" w:lineRule="auto"/>
@@ -1885,6 +1890,7 @@
     <w:p>
       <w:pPr>
         <w:numPr>
+          <w:ilvl w:val="0"/>
           <w:numId w:val="0"/>
         </w:numPr>
         <w:spacing w:line="360" w:lineRule="auto"/>
@@ -1924,6 +1930,7 @@
     <w:p>
       <w:pPr>
         <w:numPr>
+          <w:ilvl w:val="0"/>
           <w:numId w:val="0"/>
         </w:numPr>
         <w:spacing w:line="360" w:lineRule="auto"/>
@@ -2038,6 +2045,7 @@
     <w:p>
       <w:pPr>
         <w:numPr>
+          <w:ilvl w:val="0"/>
           <w:numId w:val="0"/>
         </w:numPr>
         <w:spacing w:line="360" w:lineRule="auto"/>
@@ -2077,6 +2085,7 @@
     <w:p>
       <w:pPr>
         <w:numPr>
+          <w:ilvl w:val="0"/>
           <w:numId w:val="0"/>
         </w:numPr>
         <w:spacing w:line="360" w:lineRule="auto"/>
@@ -2116,6 +2125,7 @@
     <w:p>
       <w:pPr>
         <w:numPr>
+          <w:ilvl w:val="0"/>
           <w:numId w:val="0"/>
         </w:numPr>
         <w:spacing w:line="360" w:lineRule="auto"/>
@@ -2155,6 +2165,7 @@
     <w:p>
       <w:pPr>
         <w:numPr>
+          <w:ilvl w:val="0"/>
           <w:numId w:val="0"/>
         </w:numPr>
         <w:spacing w:line="360" w:lineRule="auto"/>
@@ -2172,6 +2183,7 @@
     <w:p>
       <w:pPr>
         <w:numPr>
+          <w:ilvl w:val="0"/>
           <w:numId w:val="0"/>
         </w:numPr>
         <w:spacing w:line="360" w:lineRule="auto"/>
@@ -2200,6 +2212,7 @@
     <w:p>
       <w:pPr>
         <w:numPr>
+          <w:ilvl w:val="0"/>
           <w:numId w:val="0"/>
         </w:numPr>
         <w:spacing w:line="360" w:lineRule="auto"/>
@@ -2239,6 +2252,7 @@
     <w:p>
       <w:pPr>
         <w:numPr>
+          <w:ilvl w:val="0"/>
           <w:numId w:val="0"/>
         </w:numPr>
         <w:spacing w:line="360" w:lineRule="auto"/>
@@ -2278,6 +2292,7 @@
     <w:p>
       <w:pPr>
         <w:numPr>
+          <w:ilvl w:val="0"/>
           <w:numId w:val="0"/>
         </w:numPr>
         <w:spacing w:line="360" w:lineRule="auto"/>
@@ -2317,6 +2332,7 @@
     <w:p>
       <w:pPr>
         <w:numPr>
+          <w:ilvl w:val="0"/>
           <w:numId w:val="0"/>
         </w:numPr>
         <w:spacing w:line="360" w:lineRule="auto"/>
@@ -2356,6 +2372,7 @@
     <w:p>
       <w:pPr>
         <w:numPr>
+          <w:ilvl w:val="0"/>
           <w:numId w:val="0"/>
         </w:numPr>
         <w:spacing w:line="360" w:lineRule="auto"/>
@@ -2395,6 +2412,7 @@
     <w:p>
       <w:pPr>
         <w:numPr>
+          <w:ilvl w:val="0"/>
           <w:numId w:val="0"/>
         </w:numPr>
         <w:spacing w:line="360" w:lineRule="auto"/>
@@ -2412,6 +2430,7 @@
     <w:p>
       <w:pPr>
         <w:numPr>
+          <w:ilvl w:val="0"/>
           <w:numId w:val="0"/>
         </w:numPr>
         <w:spacing w:line="360" w:lineRule="auto"/>
@@ -2440,6 +2459,7 @@
     <w:p>
       <w:pPr>
         <w:numPr>
+          <w:ilvl w:val="0"/>
           <w:numId w:val="0"/>
         </w:numPr>
         <w:spacing w:line="360" w:lineRule="auto"/>
@@ -2479,6 +2499,7 @@
     <w:p>
       <w:pPr>
         <w:numPr>
+          <w:ilvl w:val="0"/>
           <w:numId w:val="0"/>
         </w:numPr>
         <w:spacing w:line="360" w:lineRule="auto"/>
@@ -2518,6 +2539,7 @@
     <w:p>
       <w:pPr>
         <w:numPr>
+          <w:ilvl w:val="0"/>
           <w:numId w:val="0"/>
         </w:numPr>
         <w:spacing w:line="360" w:lineRule="auto"/>
@@ -2557,6 +2579,7 @@
     <w:p>
       <w:pPr>
         <w:numPr>
+          <w:ilvl w:val="0"/>
           <w:numId w:val="0"/>
         </w:numPr>
         <w:spacing w:line="360" w:lineRule="auto"/>
@@ -2596,6 +2619,7 @@
     <w:p>
       <w:pPr>
         <w:numPr>
+          <w:ilvl w:val="0"/>
           <w:numId w:val="0"/>
         </w:numPr>
         <w:spacing w:line="360" w:lineRule="auto"/>
@@ -2635,6 +2659,7 @@
     <w:p>
       <w:pPr>
         <w:numPr>
+          <w:ilvl w:val="0"/>
           <w:numId w:val="0"/>
         </w:numPr>
         <w:spacing w:line="360" w:lineRule="auto"/>
@@ -2652,6 +2677,7 @@
     <w:p>
       <w:pPr>
         <w:numPr>
+          <w:ilvl w:val="0"/>
           <w:numId w:val="0"/>
         </w:numPr>
         <w:spacing w:line="360" w:lineRule="auto"/>
@@ -2681,6 +2707,7 @@
     <w:p>
       <w:pPr>
         <w:numPr>
+          <w:ilvl w:val="0"/>
           <w:numId w:val="0"/>
         </w:numPr>
         <w:spacing w:line="360" w:lineRule="auto"/>
@@ -2710,7 +2737,9 @@
         </w:tblBorders>
         <w:tblLayout w:type="fixed"/>
         <w:tblCellMar>
+          <w:top w:w="0" w:type="dxa"/>
           <w:left w:w="108" w:type="dxa"/>
+          <w:bottom w:w="0" w:type="dxa"/>
           <w:right w:w="108" w:type="dxa"/>
         </w:tblCellMar>
       </w:tblPr>
@@ -2731,6 +2760,12 @@
             <w:insideH w:val="single" w:color="auto" w:sz="4" w:space="0"/>
             <w:insideV w:val="single" w:color="auto" w:sz="4" w:space="0"/>
           </w:tblBorders>
+          <w:tblCellMar>
+            <w:top w:w="0" w:type="dxa"/>
+            <w:left w:w="108" w:type="dxa"/>
+            <w:bottom w:w="0" w:type="dxa"/>
+            <w:right w:w="108" w:type="dxa"/>
+          </w:tblCellMar>
         </w:tblPrEx>
         <w:tc>
           <w:tcPr>
@@ -2738,7 +2773,9 @@
           </w:tcPr>
           <w:p>
             <w:pPr>
+              <w:widowControl w:val="0"/>
               <w:numPr>
+                <w:ilvl w:val="0"/>
                 <w:numId w:val="0"/>
               </w:numPr>
               <w:spacing w:line="360" w:lineRule="auto"/>
@@ -2773,7 +2810,9 @@
           </w:tcPr>
           <w:p>
             <w:pPr>
+              <w:widowControl w:val="0"/>
               <w:numPr>
+                <w:ilvl w:val="0"/>
                 <w:numId w:val="0"/>
               </w:numPr>
               <w:spacing w:line="360" w:lineRule="auto"/>
@@ -2808,7 +2847,9 @@
           </w:tcPr>
           <w:p>
             <w:pPr>
+              <w:widowControl w:val="0"/>
               <w:numPr>
+                <w:ilvl w:val="0"/>
                 <w:numId w:val="0"/>
               </w:numPr>
               <w:spacing w:line="360" w:lineRule="auto"/>
@@ -2843,7 +2884,9 @@
           </w:tcPr>
           <w:p>
             <w:pPr>
+              <w:widowControl w:val="0"/>
               <w:numPr>
+                <w:ilvl w:val="0"/>
                 <w:numId w:val="0"/>
               </w:numPr>
               <w:spacing w:line="360" w:lineRule="auto"/>
@@ -2878,7 +2921,9 @@
           </w:tcPr>
           <w:p>
             <w:pPr>
+              <w:widowControl w:val="0"/>
               <w:numPr>
+                <w:ilvl w:val="0"/>
                 <w:numId w:val="0"/>
               </w:numPr>
               <w:spacing w:line="360" w:lineRule="auto"/>
@@ -2919,7 +2964,9 @@
             <w:insideV w:val="single" w:color="auto" w:sz="4" w:space="0"/>
           </w:tblBorders>
           <w:tblCellMar>
+            <w:top w:w="0" w:type="dxa"/>
             <w:left w:w="108" w:type="dxa"/>
+            <w:bottom w:w="0" w:type="dxa"/>
             <w:right w:w="108" w:type="dxa"/>
           </w:tblCellMar>
         </w:tblPrEx>
@@ -2929,7 +2976,9 @@
           </w:tcPr>
           <w:p>
             <w:pPr>
+              <w:widowControl w:val="0"/>
               <w:numPr>
+                <w:ilvl w:val="0"/>
                 <w:numId w:val="0"/>
               </w:numPr>
               <w:spacing w:line="360" w:lineRule="auto"/>
@@ -2964,7 +3013,9 @@
           </w:tcPr>
           <w:p>
             <w:pPr>
+              <w:widowControl w:val="0"/>
               <w:numPr>
+                <w:ilvl w:val="0"/>
                 <w:numId w:val="0"/>
               </w:numPr>
               <w:spacing w:line="360" w:lineRule="auto"/>
@@ -2999,7 +3050,9 @@
           </w:tcPr>
           <w:p>
             <w:pPr>
+              <w:widowControl w:val="0"/>
               <w:numPr>
+                <w:ilvl w:val="0"/>
                 <w:numId w:val="0"/>
               </w:numPr>
               <w:spacing w:line="360" w:lineRule="auto"/>
@@ -3034,7 +3087,9 @@
           </w:tcPr>
           <w:p>
             <w:pPr>
+              <w:widowControl w:val="0"/>
               <w:numPr>
+                <w:ilvl w:val="0"/>
                 <w:numId w:val="0"/>
               </w:numPr>
               <w:spacing w:line="360" w:lineRule="auto"/>
@@ -3069,7 +3124,9 @@
           </w:tcPr>
           <w:p>
             <w:pPr>
+              <w:widowControl w:val="0"/>
               <w:numPr>
+                <w:ilvl w:val="0"/>
                 <w:numId w:val="0"/>
               </w:numPr>
               <w:spacing w:line="360" w:lineRule="auto"/>
@@ -3110,7 +3167,9 @@
             <w:insideV w:val="single" w:color="auto" w:sz="4" w:space="0"/>
           </w:tblBorders>
           <w:tblCellMar>
+            <w:top w:w="0" w:type="dxa"/>
             <w:left w:w="108" w:type="dxa"/>
+            <w:bottom w:w="0" w:type="dxa"/>
             <w:right w:w="108" w:type="dxa"/>
           </w:tblCellMar>
         </w:tblPrEx>
@@ -3120,7 +3179,9 @@
           </w:tcPr>
           <w:p>
             <w:pPr>
+              <w:widowControl w:val="0"/>
               <w:numPr>
+                <w:ilvl w:val="0"/>
                 <w:numId w:val="0"/>
               </w:numPr>
               <w:spacing w:line="360" w:lineRule="auto"/>
@@ -3155,7 +3216,9 @@
           </w:tcPr>
           <w:p>
             <w:pPr>
+              <w:widowControl w:val="0"/>
               <w:numPr>
+                <w:ilvl w:val="0"/>
                 <w:numId w:val="0"/>
               </w:numPr>
               <w:spacing w:line="360" w:lineRule="auto"/>
@@ -3190,7 +3253,9 @@
           </w:tcPr>
           <w:p>
             <w:pPr>
+              <w:widowControl w:val="0"/>
               <w:numPr>
+                <w:ilvl w:val="0"/>
                 <w:numId w:val="0"/>
               </w:numPr>
               <w:spacing w:line="360" w:lineRule="auto"/>
@@ -3225,7 +3290,9 @@
           </w:tcPr>
           <w:p>
             <w:pPr>
+              <w:widowControl w:val="0"/>
               <w:numPr>
+                <w:ilvl w:val="0"/>
                 <w:numId w:val="0"/>
               </w:numPr>
               <w:spacing w:line="360" w:lineRule="auto"/>
@@ -3260,7 +3327,9 @@
           </w:tcPr>
           <w:p>
             <w:pPr>
+              <w:widowControl w:val="0"/>
               <w:numPr>
+                <w:ilvl w:val="0"/>
                 <w:numId w:val="0"/>
               </w:numPr>
               <w:spacing w:line="360" w:lineRule="auto"/>
@@ -3301,7 +3370,9 @@
             <w:insideV w:val="single" w:color="auto" w:sz="4" w:space="0"/>
           </w:tblBorders>
           <w:tblCellMar>
+            <w:top w:w="0" w:type="dxa"/>
             <w:left w:w="108" w:type="dxa"/>
+            <w:bottom w:w="0" w:type="dxa"/>
             <w:right w:w="108" w:type="dxa"/>
           </w:tblCellMar>
         </w:tblPrEx>
@@ -3311,7 +3382,9 @@
           </w:tcPr>
           <w:p>
             <w:pPr>
+              <w:widowControl w:val="0"/>
               <w:numPr>
+                <w:ilvl w:val="0"/>
                 <w:numId w:val="0"/>
               </w:numPr>
               <w:spacing w:line="360" w:lineRule="auto"/>
@@ -3346,7 +3419,9 @@
           </w:tcPr>
           <w:p>
             <w:pPr>
+              <w:widowControl w:val="0"/>
               <w:numPr>
+                <w:ilvl w:val="0"/>
                 <w:numId w:val="0"/>
               </w:numPr>
               <w:spacing w:line="360" w:lineRule="auto"/>
@@ -3381,7 +3456,9 @@
           </w:tcPr>
           <w:p>
             <w:pPr>
+              <w:widowControl w:val="0"/>
               <w:numPr>
+                <w:ilvl w:val="0"/>
                 <w:numId w:val="0"/>
               </w:numPr>
               <w:spacing w:line="360" w:lineRule="auto"/>
@@ -3416,7 +3493,9 @@
           </w:tcPr>
           <w:p>
             <w:pPr>
+              <w:widowControl w:val="0"/>
               <w:numPr>
+                <w:ilvl w:val="0"/>
                 <w:numId w:val="0"/>
               </w:numPr>
               <w:spacing w:line="360" w:lineRule="auto"/>
@@ -3451,7 +3530,9 @@
           </w:tcPr>
           <w:p>
             <w:pPr>
+              <w:widowControl w:val="0"/>
               <w:numPr>
+                <w:ilvl w:val="0"/>
                 <w:numId w:val="0"/>
               </w:numPr>
               <w:spacing w:line="360" w:lineRule="auto"/>
@@ -3485,23 +3566,25 @@
     <w:p>
       <w:pPr>
         <w:numPr>
-          <w:numId w:val="0"/>
-        </w:numPr>
-        <w:spacing w:line="360" w:lineRule="auto"/>
-        <w:jc w:val="both"/>
-        <w:rPr>
-          <w:rFonts w:hint="default" w:ascii="Times New Roman" w:hAnsi="Times New Roman" w:cs="Times New Roman"/>
-          <w:b/>
-          <w:bCs/>
-          <w:sz w:val="22"/>
-          <w:szCs w:val="22"/>
-          <w:lang w:val="en-US"/>
-        </w:rPr>
-      </w:pPr>
-    </w:p>
-    <w:p>
-      <w:pPr>
-        <w:numPr>
+          <w:ilvl w:val="0"/>
+          <w:numId w:val="0"/>
+        </w:numPr>
+        <w:spacing w:line="360" w:lineRule="auto"/>
+        <w:jc w:val="both"/>
+        <w:rPr>
+          <w:rFonts w:hint="default" w:ascii="Times New Roman" w:hAnsi="Times New Roman" w:cs="Times New Roman"/>
+          <w:b/>
+          <w:bCs/>
+          <w:sz w:val="22"/>
+          <w:szCs w:val="22"/>
+          <w:lang w:val="en-US"/>
+        </w:rPr>
+      </w:pPr>
+    </w:p>
+    <w:p>
+      <w:pPr>
+        <w:numPr>
+          <w:ilvl w:val="0"/>
           <w:numId w:val="0"/>
         </w:numPr>
         <w:spacing w:line="360" w:lineRule="auto"/>
@@ -3612,6 +3695,7 @@
     <w:p>
       <w:pPr>
         <w:numPr>
+          <w:ilvl w:val="0"/>
           <w:numId w:val="0"/>
         </w:numPr>
         <w:spacing w:line="360" w:lineRule="auto"/>
@@ -4270,7 +4354,7 @@
     <w:lsdException w:unhideWhenUsed="0" w:uiPriority="0" w:semiHidden="0" w:name="Table Web 2"/>
     <w:lsdException w:unhideWhenUsed="0" w:uiPriority="0" w:semiHidden="0" w:name="Table Web 3"/>
     <w:lsdException w:unhideWhenUsed="0" w:uiPriority="0" w:semiHidden="0" w:name="Balloon Text"/>
-    <w:lsdException w:unhideWhenUsed="0" w:uiPriority="0" w:semiHidden="0" w:name="Table Grid"/>
+    <w:lsdException w:qFormat="1" w:unhideWhenUsed="0" w:uiPriority="0" w:semiHidden="0" w:name="Table Grid"/>
     <w:lsdException w:unhideWhenUsed="0" w:uiPriority="0" w:semiHidden="0" w:name="Table Theme"/>
     <w:lsdException w:unhideWhenUsed="0" w:uiPriority="60" w:semiHidden="0" w:name="Light Shading"/>
     <w:lsdException w:unhideWhenUsed="0" w:uiPriority="61" w:semiHidden="0" w:name="Light List"/>
@@ -4403,6 +4487,7 @@
   <w:style w:type="table" w:styleId="4">
     <w:name w:val="Table Grid"/>
     <w:basedOn w:val="3"/>
+    <w:qFormat/>
     <w:uiPriority w:val="0"/>
     <w:pPr>
       <w:widowControl w:val="0"/>

</xml_diff>